<commit_message>
Various improvements and documentation updates
</commit_message>
<xml_diff>
--- a/docs/Getting Started.docx
+++ b/docs/Getting Started.docx
@@ -6,13 +6,8 @@
       <w:pPr>
         <w:pStyle w:val="Heading1"/>
       </w:pPr>
-      <w:proofErr w:type="spellStart"/>
-      <w:r>
-        <w:t>BeebPerf</w:t>
-      </w:r>
-      <w:proofErr w:type="spellEnd"/>
-      <w:r>
-        <w:t xml:space="preserve"> </w:t>
+      <w:r>
+        <w:t xml:space="preserve">BeebPerf </w:t>
       </w:r>
     </w:p>
     <w:p>
@@ -350,7 +345,21 @@
           <w:rFonts w:ascii="Aptos" w:hAnsi="Aptos"/>
           <w:color w:val="000000"/>
         </w:rPr>
-        <w:t xml:space="preserve"> relative to the others within that routine.</w:t>
+        <w:t xml:space="preserve"> relative to the other</w:t>
+      </w:r>
+      <w:r>
+        <w:rPr>
+          <w:rFonts w:ascii="Aptos" w:hAnsi="Aptos"/>
+          <w:color w:val="000000"/>
+        </w:rPr>
+        <w:t xml:space="preserve"> instructions </w:t>
+      </w:r>
+      <w:r>
+        <w:rPr>
+          <w:rFonts w:ascii="Aptos" w:hAnsi="Aptos"/>
+          <w:color w:val="000000"/>
+        </w:rPr>
+        <w:t>within that routine.</w:t>
       </w:r>
     </w:p>
     <w:p>
@@ -592,11 +601,9 @@
             <w:tcW w:w="3192" w:type="dxa"/>
           </w:tcPr>
           <w:p>
-            <w:proofErr w:type="spellStart"/>
-            <w:r>
-              <w:t>Self CPU</w:t>
-            </w:r>
-            <w:proofErr w:type="spellEnd"/>
+            <w:r>
+              <w:t>Total CPU</w:t>
+            </w:r>
           </w:p>
         </w:tc>
         <w:tc>
@@ -605,7 +612,7 @@
           </w:tcPr>
           <w:p>
             <w:r>
-              <w:t>The number of cycles spent inside a routine itself.</w:t>
+              <w:t>The number of cycles spent inside a routine, plus all those spent in called routines, and routines that they call, and so on.</w:t>
             </w:r>
           </w:p>
         </w:tc>
@@ -618,7 +625,7 @@
           <w:p>
             <w:r>
               <w:lastRenderedPageBreak/>
-              <w:t>Total CPU</w:t>
+              <w:t>Self CPU</w:t>
             </w:r>
           </w:p>
         </w:tc>
@@ -628,7 +635,7 @@
           </w:tcPr>
           <w:p>
             <w:r>
-              <w:t>The number of cycles spent inside a routine, plus all those spent in called routines, and routines that they call, and so on.</w:t>
+              <w:t>The number of cycles spent inside a routine itself.</w:t>
             </w:r>
           </w:p>
         </w:tc>
@@ -672,15 +679,7 @@
           </w:tcPr>
           <w:p>
             <w:r>
-              <w:t xml:space="preserve">The total CPU cycle count </w:t>
-            </w:r>
-            <w:proofErr w:type="gramStart"/>
-            <w:r>
-              <w:t>spent</w:t>
-            </w:r>
-            <w:proofErr w:type="gramEnd"/>
-            <w:r>
-              <w:t xml:space="preserve"> servicing interrupts.</w:t>
+              <w:t>The total CPU cycle count spent servicing interrupts.</w:t>
             </w:r>
           </w:p>
           <w:p>
@@ -781,7 +780,12 @@
           </w:tcPr>
           <w:p>
             <w:r>
-              <w:t>Total CPU</w:t>
+              <w:t>Reads from &lt;address&gt; &amp;</w:t>
+            </w:r>
+          </w:p>
+          <w:p>
+            <w:r>
+              <w:t>Writes to &lt;address&gt;</w:t>
             </w:r>
           </w:p>
         </w:tc>
@@ -791,13 +795,7 @@
           </w:tcPr>
           <w:p>
             <w:r>
-              <w:t xml:space="preserve">The number of cycles spent executing the instruction. </w:t>
-            </w:r>
-            <w:r>
-              <w:t xml:space="preserve"> </w:t>
-            </w:r>
-            <w:r>
-              <w:t>If the instruction is a JSR or tail call, it includes all the cycles spent in the called routine, and subsequent nested calls.</w:t>
+              <w:t>These columns are shown when a routine is selected within the Memory Tab’s right-hand panel.  The columns show the number of times the instruction read or wrote to the selected address.</w:t>
             </w:r>
           </w:p>
         </w:tc>
@@ -809,7 +807,7 @@
           </w:tcPr>
           <w:p>
             <w:r>
-              <w:t>Branch Count</w:t>
+              <w:t>Tail Call</w:t>
             </w:r>
           </w:p>
         </w:tc>
@@ -819,22 +817,7 @@
           </w:tcPr>
           <w:p>
             <w:r>
-              <w:t>The number of times the branch was taken.</w:t>
-            </w:r>
-            <w:r>
-              <w:t xml:space="preserve"> </w:t>
-            </w:r>
-            <w:r>
-              <w:t xml:space="preserve"> The percentage </w:t>
-            </w:r>
-            <w:r>
-              <w:t>shows</w:t>
-            </w:r>
-            <w:r>
-              <w:t xml:space="preserve"> the percentage of times the branch was taken</w:t>
-            </w:r>
-            <w:r>
-              <w:t>.</w:t>
+              <w:t>Shows whether a jump or branch instruction is a tail call, where a tail call passes execution to another routine.</w:t>
             </w:r>
           </w:p>
         </w:tc>
@@ -846,7 +829,7 @@
           </w:tcPr>
           <w:p>
             <w:r>
-              <w:t>Execution Count</w:t>
+              <w:t>Total CPU</w:t>
             </w:r>
           </w:p>
         </w:tc>
@@ -856,46 +839,7 @@
           </w:tcPr>
           <w:p>
             <w:r>
-              <w:t>The number of times the instruction was executed.</w:t>
-            </w:r>
-            <w:r>
-              <w:t xml:space="preserve"> </w:t>
-            </w:r>
-            <w:r>
-              <w:t xml:space="preserve"> </w:t>
-            </w:r>
-            <w:r>
-              <w:t xml:space="preserve">The percentage </w:t>
-            </w:r>
-            <w:r>
-              <w:t>show</w:t>
-            </w:r>
-            <w:r>
-              <w:t>s</w:t>
-            </w:r>
-            <w:r>
-              <w:t xml:space="preserve"> </w:t>
-            </w:r>
-            <w:r>
-              <w:t>how this compare</w:t>
-            </w:r>
-            <w:r>
-              <w:t>s</w:t>
-            </w:r>
-            <w:r>
-              <w:t xml:space="preserve"> </w:t>
-            </w:r>
-            <w:r>
-              <w:t>with</w:t>
-            </w:r>
-            <w:r>
-              <w:t xml:space="preserve"> the </w:t>
-            </w:r>
-            <w:r>
-              <w:t>other instructions</w:t>
-            </w:r>
-            <w:r>
-              <w:t>.</w:t>
+              <w:t>The number of cycles spent executing the instruction.  If the instruction is a JSR or tail call, it includes all the cycles spent in the called routine, and subsequent nested calls.</w:t>
             </w:r>
           </w:p>
         </w:tc>
@@ -907,7 +851,7 @@
           </w:tcPr>
           <w:p>
             <w:r>
-              <w:t>Tail Call</w:t>
+              <w:t>Self CPU</w:t>
             </w:r>
           </w:p>
         </w:tc>
@@ -917,13 +861,13 @@
           </w:tcPr>
           <w:p>
             <w:r>
-              <w:t>Shows whether a jump or branch instruction is a tail call</w:t>
-            </w:r>
-            <w:r>
-              <w:t xml:space="preserve">, where a tail call passes execution to </w:t>
-            </w:r>
-            <w:r>
-              <w:t>another routine.</w:t>
+              <w:t xml:space="preserve">The number of cycles spent </w:t>
+            </w:r>
+            <w:r>
+              <w:t>executing just the instruction</w:t>
+            </w:r>
+            <w:r>
+              <w:t>.</w:t>
             </w:r>
           </w:p>
         </w:tc>
@@ -935,12 +879,7 @@
           </w:tcPr>
           <w:p>
             <w:r>
-              <w:t>Reads from &lt;address&gt; &amp;</w:t>
-            </w:r>
-          </w:p>
-          <w:p>
-            <w:r>
-              <w:t>Writes to &lt;address&gt;</w:t>
+              <w:t>Branch Count</w:t>
             </w:r>
           </w:p>
         </w:tc>
@@ -950,39 +889,29 @@
           </w:tcPr>
           <w:p>
             <w:r>
-              <w:t>These columns are shown when a routine is selected within the Memory Tab’s right</w:t>
-            </w:r>
-            <w:r>
-              <w:t>-</w:t>
-            </w:r>
-            <w:r>
-              <w:t xml:space="preserve">hand panel. </w:t>
-            </w:r>
-            <w:r>
-              <w:t xml:space="preserve"> </w:t>
-            </w:r>
-            <w:r>
-              <w:t xml:space="preserve">The columns </w:t>
-            </w:r>
-            <w:r>
-              <w:t>show</w:t>
-            </w:r>
-            <w:r>
-              <w:t xml:space="preserve"> the number of times the </w:t>
-            </w:r>
-            <w:proofErr w:type="gramStart"/>
-            <w:r>
-              <w:t>instruction</w:t>
-            </w:r>
-            <w:proofErr w:type="gramEnd"/>
-            <w:r>
-              <w:t xml:space="preserve"> read or wrote to the </w:t>
-            </w:r>
-            <w:r>
-              <w:t xml:space="preserve">selected </w:t>
-            </w:r>
-            <w:r>
-              <w:t>address.</w:t>
+              <w:t>The number of times the branch was taken.  The percentage shows the percentage of times the branch was taken.</w:t>
+            </w:r>
+          </w:p>
+        </w:tc>
+      </w:tr>
+      <w:tr>
+        <w:tc>
+          <w:tcPr>
+            <w:tcW w:w="3192" w:type="dxa"/>
+          </w:tcPr>
+          <w:p>
+            <w:r>
+              <w:t>Execution Count</w:t>
+            </w:r>
+          </w:p>
+        </w:tc>
+        <w:tc>
+          <w:tcPr>
+            <w:tcW w:w="6636" w:type="dxa"/>
+          </w:tcPr>
+          <w:p>
+            <w:r>
+              <w:t>The number of times the instruction was executed.  The percentage shows how this compares with the other instructions.</w:t>
             </w:r>
           </w:p>
         </w:tc>
@@ -1043,7 +972,21 @@
           <w:rFonts w:ascii="Aptos" w:hAnsi="Aptos"/>
           <w:color w:val="000000"/>
         </w:rPr>
-        <w:t>For example, in the Call Tree tab, a child node may represent a tail call, and the last child may be a fall-though.</w:t>
+        <w:t xml:space="preserve">For example, in the Call Tree tab, a child node may represent a tail call, and the last child may </w:t>
+      </w:r>
+      <w:r>
+        <w:rPr>
+          <w:rFonts w:ascii="Aptos" w:hAnsi="Aptos"/>
+          <w:color w:val="000000"/>
+        </w:rPr>
+        <w:t xml:space="preserve">represent </w:t>
+      </w:r>
+      <w:r>
+        <w:rPr>
+          <w:rFonts w:ascii="Aptos" w:hAnsi="Aptos"/>
+          <w:color w:val="000000"/>
+        </w:rPr>
+        <w:t>a fall-though.</w:t>
       </w:r>
     </w:p>
     <w:p>
@@ -1624,13 +1567,57 @@
     <w:lsdException w:name="HTML Sample" w:semiHidden="1" w:unhideWhenUsed="1"/>
     <w:lsdException w:name="HTML Typewriter" w:semiHidden="1" w:unhideWhenUsed="1"/>
     <w:lsdException w:name="HTML Variable" w:semiHidden="1" w:unhideWhenUsed="1"/>
+    <w:lsdException w:name="Normal Table" w:semiHidden="1" w:unhideWhenUsed="1"/>
     <w:lsdException w:name="annotation subject" w:semiHidden="1" w:unhideWhenUsed="1"/>
     <w:lsdException w:name="No List" w:semiHidden="1" w:unhideWhenUsed="1"/>
     <w:lsdException w:name="Outline List 1" w:semiHidden="1" w:unhideWhenUsed="1"/>
     <w:lsdException w:name="Outline List 2" w:semiHidden="1" w:unhideWhenUsed="1"/>
     <w:lsdException w:name="Outline List 3" w:semiHidden="1" w:unhideWhenUsed="1"/>
+    <w:lsdException w:name="Table Simple 1" w:semiHidden="1" w:unhideWhenUsed="1"/>
+    <w:lsdException w:name="Table Simple 2" w:semiHidden="1" w:unhideWhenUsed="1"/>
+    <w:lsdException w:name="Table Simple 3" w:semiHidden="1" w:unhideWhenUsed="1"/>
+    <w:lsdException w:name="Table Classic 1" w:semiHidden="1" w:unhideWhenUsed="1"/>
+    <w:lsdException w:name="Table Classic 2" w:semiHidden="1" w:unhideWhenUsed="1"/>
+    <w:lsdException w:name="Table Classic 3" w:semiHidden="1" w:unhideWhenUsed="1"/>
+    <w:lsdException w:name="Table Classic 4" w:semiHidden="1" w:unhideWhenUsed="1"/>
+    <w:lsdException w:name="Table Colorful 1" w:semiHidden="1" w:unhideWhenUsed="1"/>
+    <w:lsdException w:name="Table Colorful 2" w:semiHidden="1" w:unhideWhenUsed="1"/>
+    <w:lsdException w:name="Table Colorful 3" w:semiHidden="1" w:unhideWhenUsed="1"/>
+    <w:lsdException w:name="Table Columns 1" w:semiHidden="1" w:unhideWhenUsed="1"/>
+    <w:lsdException w:name="Table Columns 2" w:semiHidden="1" w:unhideWhenUsed="1"/>
+    <w:lsdException w:name="Table Columns 3" w:semiHidden="1" w:unhideWhenUsed="1"/>
+    <w:lsdException w:name="Table Columns 4" w:semiHidden="1" w:unhideWhenUsed="1"/>
+    <w:lsdException w:name="Table Columns 5" w:semiHidden="1" w:unhideWhenUsed="1"/>
+    <w:lsdException w:name="Table Grid 1" w:semiHidden="1" w:unhideWhenUsed="1"/>
+    <w:lsdException w:name="Table Grid 2" w:semiHidden="1" w:unhideWhenUsed="1"/>
+    <w:lsdException w:name="Table Grid 3" w:semiHidden="1" w:unhideWhenUsed="1"/>
+    <w:lsdException w:name="Table Grid 4" w:semiHidden="1" w:unhideWhenUsed="1"/>
+    <w:lsdException w:name="Table Grid 5" w:semiHidden="1" w:unhideWhenUsed="1"/>
+    <w:lsdException w:name="Table Grid 6" w:semiHidden="1" w:unhideWhenUsed="1"/>
+    <w:lsdException w:name="Table Grid 7" w:semiHidden="1" w:unhideWhenUsed="1"/>
+    <w:lsdException w:name="Table Grid 8" w:semiHidden="1" w:unhideWhenUsed="1"/>
+    <w:lsdException w:name="Table List 1" w:semiHidden="1" w:unhideWhenUsed="1"/>
+    <w:lsdException w:name="Table List 2" w:semiHidden="1" w:unhideWhenUsed="1"/>
+    <w:lsdException w:name="Table List 3" w:semiHidden="1" w:unhideWhenUsed="1"/>
+    <w:lsdException w:name="Table List 4" w:semiHidden="1" w:unhideWhenUsed="1"/>
+    <w:lsdException w:name="Table List 5" w:semiHidden="1" w:unhideWhenUsed="1"/>
+    <w:lsdException w:name="Table List 6" w:semiHidden="1" w:unhideWhenUsed="1"/>
+    <w:lsdException w:name="Table List 7" w:semiHidden="1" w:unhideWhenUsed="1"/>
+    <w:lsdException w:name="Table List 8" w:semiHidden="1" w:unhideWhenUsed="1"/>
+    <w:lsdException w:name="Table 3D effects 1" w:semiHidden="1" w:unhideWhenUsed="1"/>
+    <w:lsdException w:name="Table 3D effects 2" w:semiHidden="1" w:unhideWhenUsed="1"/>
+    <w:lsdException w:name="Table 3D effects 3" w:semiHidden="1" w:unhideWhenUsed="1"/>
+    <w:lsdException w:name="Table Contemporary" w:semiHidden="1" w:unhideWhenUsed="1"/>
+    <w:lsdException w:name="Table Elegant" w:semiHidden="1" w:unhideWhenUsed="1"/>
+    <w:lsdException w:name="Table Professional" w:semiHidden="1" w:unhideWhenUsed="1"/>
+    <w:lsdException w:name="Table Subtle 1" w:semiHidden="1" w:unhideWhenUsed="1"/>
+    <w:lsdException w:name="Table Subtle 2" w:semiHidden="1" w:unhideWhenUsed="1"/>
+    <w:lsdException w:name="Table Web 1" w:semiHidden="1" w:unhideWhenUsed="1"/>
+    <w:lsdException w:name="Table Web 2" w:semiHidden="1" w:unhideWhenUsed="1"/>
+    <w:lsdException w:name="Table Web 3" w:semiHidden="1" w:unhideWhenUsed="1"/>
     <w:lsdException w:name="Balloon Text" w:semiHidden="1" w:unhideWhenUsed="1"/>
     <w:lsdException w:name="Table Grid" w:uiPriority="39"/>
+    <w:lsdException w:name="Table Theme" w:semiHidden="1" w:unhideWhenUsed="1"/>
     <w:lsdException w:name="Placeholder Text" w:semiHidden="1"/>
     <w:lsdException w:name="No Spacing" w:uiPriority="1" w:qFormat="1"/>
     <w:lsdException w:name="Light Shading" w:uiPriority="60"/>
@@ -1926,6 +1913,7 @@
   <w:style w:type="character" w:default="1" w:styleId="DefaultParagraphFont">
     <w:name w:val="Default Paragraph Font"/>
     <w:uiPriority w:val="1"/>
+    <w:semiHidden/>
     <w:unhideWhenUsed/>
   </w:style>
   <w:style w:type="table" w:default="1" w:styleId="TableNormal">

</xml_diff>